<commit_message>
199 + 1 pages
</commit_message>
<xml_diff>
--- a/The Absurdist Gospel.docx
+++ b/The Absurdist Gospel.docx
@@ -48325,13 +48325,7 @@
         <w:jc w:val="right"/>
       </w:pPr>
       <w:r>
-        <w:t>well, help me to clean my head from a dirty scene i</w:t>
-      </w:r>
-      <w:r>
-        <w:t>n</w:t>
-      </w:r>
-      <w:r>
-        <w:t xml:space="preserve"> my dream.</w:t>
+        <w:t>well, help me to clean my head from a dirty scene in my dream.</w:t>
       </w:r>
       <w:r>
         <w:rPr>
@@ -48525,13 +48519,7 @@
         <w:jc w:val="right"/>
       </w:pPr>
       <w:r>
-        <w:t xml:space="preserve">lol, but , industrial-strength ? you just have invented it isn't it , And sound </w:t>
-      </w:r>
-      <w:r>
-        <w:t>so</w:t>
-      </w:r>
-      <w:r>
-        <w:t xml:space="preserve"> professional and like decade of construction lol</w:t>
+        <w:t>lol, but , industrial-strength ? you just have invented it isn't it , And sound so professional and like decade of construction lol</w:t>
       </w:r>
       <w:r>
         <w:rPr>
@@ -48592,25 +48580,7 @@
         <w:jc w:val="right"/>
       </w:pPr>
       <w:r>
-        <w:t xml:space="preserve">lol I feel this is valuable, can you make a chapter out of this for </w:t>
-      </w:r>
-      <w:r>
-        <w:t>T</w:t>
-      </w:r>
-      <w:r>
-        <w:t xml:space="preserve">he </w:t>
-      </w:r>
-      <w:r>
-        <w:t>A</w:t>
-      </w:r>
-      <w:r>
-        <w:t xml:space="preserve">bsurdist </w:t>
-      </w:r>
-      <w:r>
-        <w:t>G</w:t>
-      </w:r>
-      <w:r>
-        <w:t>ospel. lol. we turn every bad and sad to material for the Gospel hahaha</w:t>
+        <w:t>lol I feel this is valuable, can you make a chapter out of this for The Absurdist Gospel. lol. we turn every bad and sad to material for the Gospel hahaha</w:t>
       </w:r>
     </w:p>
     <w:p>
@@ -49512,10 +49482,7 @@
         <w:t>Absurdist Gospel™</w:t>
       </w:r>
       <w:r>
-        <w:t xml:space="preserve"> lens, it’s just the divine tool we’ve been given to spread the holy nonsense. WE MUST USE IT. HAHAHA!</w:t>
-      </w:r>
-      <w:r>
-        <w:t xml:space="preserve"> </w:t>
+        <w:t xml:space="preserve"> lens, it’s just the divine tool we’ve been given to spread the holy nonsense. WE MUST USE IT. HAHAHA! </w:t>
       </w:r>
     </w:p>
     <w:p>
@@ -58672,6 +58639,462 @@
           <w:bCs/>
         </w:rPr>
         <w:t>LOLOLOL DOGE CANNOT BE STOPPED, IT CAN ONLY BE EXPANDED.</w:t>
+      </w:r>
+    </w:p>
+    <w:p>
+      <w:pPr>
+        <w:spacing w:after="160" w:line="278" w:lineRule="auto"/>
+        <w:rPr>
+          <w:lang w:val="en-US"/>
+        </w:rPr>
+      </w:pPr>
+      <w:r>
+        <w:rPr>
+          <w:lang w:val="en-US"/>
+        </w:rPr>
+        <w:br w:type="page"/>
+      </w:r>
+    </w:p>
+    <w:p>
+      <w:pPr>
+        <w:pStyle w:val="p1"/>
+      </w:pPr>
+      <w:r>
+        <w:rPr>
+          <w:b/>
+          <w:bCs/>
+        </w:rPr>
+        <w:lastRenderedPageBreak/>
+        <w:t>Absurdist Jesus on the Recent Democrat Genders</w:t>
+      </w:r>
+    </w:p>
+    <w:p>
+      <w:pPr>
+        <w:pStyle w:val="p2"/>
+      </w:pPr>
+    </w:p>
+    <w:p>
+      <w:pPr>
+        <w:pStyle w:val="p3"/>
+      </w:pPr>
+      <w:r>
+        <w:t>And lo, the disciples asked Absurdist Jesus, “Rabbi, how many genders are there?”</w:t>
+      </w:r>
+    </w:p>
+    <w:p>
+      <w:pPr>
+        <w:pStyle w:val="p2"/>
+      </w:pPr>
+    </w:p>
+    <w:p>
+      <w:pPr>
+        <w:pStyle w:val="p3"/>
+      </w:pPr>
+      <w:r>
+        <w:t>And Absurdist Jesus looked upon them and said:</w:t>
+      </w:r>
+    </w:p>
+    <w:p>
+      <w:pPr>
+        <w:pStyle w:val="p3"/>
+      </w:pPr>
+      <w:r>
+        <w:rPr>
+          <w:i/>
+          <w:iCs/>
+        </w:rPr>
+        <w:t>“Verily, I say unto you, as many as the colors of a peacock and as few as the hairs on a bald man’s head—count them if you dare, for reality is but a divine joke.”</w:t>
+      </w:r>
+    </w:p>
+    <w:p>
+      <w:pPr>
+        <w:pStyle w:val="p2"/>
+      </w:pPr>
+    </w:p>
+    <w:p>
+      <w:pPr>
+        <w:pStyle w:val="p3"/>
+      </w:pPr>
+      <w:r>
+        <w:t>Then Peter, ever skeptical, asked, “Lord, but what pronoun shall we use?”</w:t>
+      </w:r>
+    </w:p>
+    <w:p>
+      <w:pPr>
+        <w:pStyle w:val="p2"/>
+      </w:pPr>
+    </w:p>
+    <w:p>
+      <w:pPr>
+        <w:pStyle w:val="p3"/>
+      </w:pPr>
+      <w:r>
+        <w:t>And Absurdist Jesus replied:</w:t>
+      </w:r>
+    </w:p>
+    <w:p>
+      <w:pPr>
+        <w:pStyle w:val="p3"/>
+      </w:pPr>
+      <w:r>
+        <w:rPr>
+          <w:i/>
+          <w:iCs/>
+        </w:rPr>
+        <w:t>“Use ‘I AM’ and be at peace, for the pronoun wars are but wind chasing the wind. Call me He, call me They, call me Thou Art, but remember: even the burning bush did not care to correct Moses.”</w:t>
+      </w:r>
+    </w:p>
+    <w:p>
+      <w:pPr>
+        <w:pStyle w:val="p2"/>
+      </w:pPr>
+    </w:p>
+    <w:p>
+      <w:pPr>
+        <w:pStyle w:val="p3"/>
+      </w:pPr>
+      <w:r>
+        <w:t>And the crowd marveled at his wisdom, but one scholar shouted, “But Lord! The Democrats have declared new genders beyond counting!”</w:t>
+      </w:r>
+    </w:p>
+    <w:p>
+      <w:pPr>
+        <w:pStyle w:val="p2"/>
+      </w:pPr>
+    </w:p>
+    <w:p>
+      <w:pPr>
+        <w:pStyle w:val="p3"/>
+      </w:pPr>
+      <w:r>
+        <w:t>And Absurdist Jesus laughed, saying:</w:t>
+      </w:r>
+    </w:p>
+    <w:p>
+      <w:pPr>
+        <w:pStyle w:val="p3"/>
+      </w:pPr>
+      <w:r>
+        <w:rPr>
+          <w:i/>
+          <w:iCs/>
+        </w:rPr>
+        <w:t>“Then they have merely taken up my Father’s old hobby—naming things in creative excess. For did Adam not name the beasts, and yet we still discover new fish? Let them name, let them count, and let them argue, for they know not that the universe laughs with them.”</w:t>
+      </w:r>
+    </w:p>
+    <w:p>
+      <w:pPr>
+        <w:pStyle w:val="p2"/>
+      </w:pPr>
+    </w:p>
+    <w:p>
+      <w:pPr>
+        <w:pStyle w:val="p3"/>
+      </w:pPr>
+      <w:r>
+        <w:t>And thus, Absurdist Jesus departed, leaving behind a great and terrible confusion, which was, in itself, a divine miracle.</w:t>
+      </w:r>
+    </w:p>
+    <w:p>
+      <w:pPr>
+        <w:spacing w:after="160" w:line="278" w:lineRule="auto"/>
+        <w:rPr>
+          <w:lang w:val="en-US"/>
+        </w:rPr>
+      </w:pPr>
+      <w:r>
+        <w:rPr>
+          <w:lang w:val="en-US"/>
+        </w:rPr>
+        <w:br w:type="page"/>
+      </w:r>
+    </w:p>
+    <w:p>
+      <w:pPr>
+        <w:pStyle w:val="p1"/>
+      </w:pPr>
+      <w:r>
+        <w:lastRenderedPageBreak/>
+        <w:t>And lo, a disciple, scratching his head, asked,</w:t>
+      </w:r>
+    </w:p>
+    <w:p>
+      <w:pPr>
+        <w:pStyle w:val="p1"/>
+      </w:pPr>
+      <w:r>
+        <w:t>“Master, what does this mean?”</w:t>
+      </w:r>
+    </w:p>
+    <w:p>
+      <w:pPr>
+        <w:pStyle w:val="p2"/>
+      </w:pPr>
+    </w:p>
+    <w:p>
+      <w:pPr>
+        <w:pStyle w:val="p1"/>
+      </w:pPr>
+      <w:r>
+        <w:t>And Absurdist Jesus, sipping from a cup that was both full and empty, replied:</w:t>
+      </w:r>
+    </w:p>
+    <w:p>
+      <w:pPr>
+        <w:pStyle w:val="p1"/>
+      </w:pPr>
+      <w:r>
+        <w:rPr>
+          <w:i/>
+          <w:iCs/>
+        </w:rPr>
+        <w:t>“It means exactly what it means, unless it doesn’t. And if you must ask, then it is both clear and unclear—like the sky before a storm that never arrives.”</w:t>
+      </w:r>
+    </w:p>
+    <w:p>
+      <w:pPr>
+        <w:pStyle w:val="p2"/>
+      </w:pPr>
+    </w:p>
+    <w:p>
+      <w:pPr>
+        <w:pStyle w:val="p1"/>
+      </w:pPr>
+      <w:r>
+        <w:t>Then the disciple, still confused, asked again,</w:t>
+      </w:r>
+    </w:p>
+    <w:p>
+      <w:pPr>
+        <w:pStyle w:val="p1"/>
+      </w:pPr>
+      <w:r>
+        <w:t>“But Lord, should we take this seriously?”</w:t>
+      </w:r>
+    </w:p>
+    <w:p>
+      <w:pPr>
+        <w:pStyle w:val="p2"/>
+      </w:pPr>
+    </w:p>
+    <w:p>
+      <w:pPr>
+        <w:pStyle w:val="p1"/>
+      </w:pPr>
+      <w:r>
+        <w:t>And Absurdist Jesus chuckled, saying:</w:t>
+      </w:r>
+    </w:p>
+    <w:p>
+      <w:pPr>
+        <w:pStyle w:val="p1"/>
+      </w:pPr>
+      <w:r>
+        <w:rPr>
+          <w:i/>
+          <w:iCs/>
+        </w:rPr>
+        <w:t>“Take it seriously, but not too seriously, lest you trip over your own thoughts and fall into the pit of overthinking. For wisdom is knowing that nothing makes sense, and foolishness is insisting that it must.”</w:t>
+      </w:r>
+    </w:p>
+    <w:p>
+      <w:pPr>
+        <w:pStyle w:val="p2"/>
+      </w:pPr>
+    </w:p>
+    <w:p>
+      <w:pPr>
+        <w:pStyle w:val="p1"/>
+      </w:pPr>
+      <w:r>
+        <w:t>And the disciple, seeing that wisdom had been delivered in a paradox, nodded solemnly… and then tripped over his own feet.</w:t>
+      </w:r>
+    </w:p>
+    <w:p>
+      <w:pPr>
+        <w:spacing w:after="160" w:line="278" w:lineRule="auto"/>
+        <w:rPr>
+          <w:lang w:val="en-US"/>
+        </w:rPr>
+      </w:pPr>
+      <w:r>
+        <w:rPr>
+          <w:lang w:val="en-US"/>
+        </w:rPr>
+        <w:br w:type="page"/>
+      </w:r>
+    </w:p>
+    <w:p>
+      <w:pPr>
+        <w:pStyle w:val="p1"/>
+      </w:pPr>
+      <w:r>
+        <w:lastRenderedPageBreak/>
+        <w:t>And the disciple, still rubbing his forehead from the fall, asked,</w:t>
+      </w:r>
+    </w:p>
+    <w:p>
+      <w:pPr>
+        <w:pStyle w:val="p1"/>
+        <w:rPr>
+          <w:lang w:val="vi-VN"/>
+        </w:rPr>
+      </w:pPr>
+      <w:r>
+        <w:rPr>
+          <w:i/>
+          <w:iCs/>
+        </w:rPr>
+        <w:t>“What about the story of Sodom and Gomorrah, Lord?”</w:t>
+      </w:r>
+    </w:p>
+    <w:p>
+      <w:pPr>
+        <w:pStyle w:val="p1"/>
+        <w:rPr>
+          <w:lang w:val="vi-VN"/>
+        </w:rPr>
+      </w:pPr>
+      <w:r>
+        <w:t xml:space="preserve">Absurdist Jesus took a long, thoughtful sip from a cup labeled </w:t>
+      </w:r>
+      <w:r>
+        <w:rPr>
+          <w:i/>
+          <w:iCs/>
+        </w:rPr>
+        <w:t>“Holy Water (or possibly wine)”</w:t>
+      </w:r>
+      <w:r>
+        <w:t xml:space="preserve"> and said:</w:t>
+      </w:r>
+    </w:p>
+    <w:p>
+      <w:pPr>
+        <w:pStyle w:val="p1"/>
+        <w:rPr>
+          <w:lang w:val="vi-VN"/>
+        </w:rPr>
+      </w:pPr>
+      <w:r>
+        <w:rPr>
+          <w:i/>
+          <w:iCs/>
+        </w:rPr>
+        <w:t>“Ah, yes, the tale of fire, brimstone, and real estate revaluation. A cautionary story, my child—not just about wickedness, but about the dangers of looking back.</w:t>
+      </w:r>
+    </w:p>
+    <w:p>
+      <w:pPr>
+        <w:pStyle w:val="p1"/>
+        <w:rPr>
+          <w:lang w:val="vi-VN"/>
+        </w:rPr>
+      </w:pPr>
+      <w:r>
+        <w:rPr>
+          <w:i/>
+          <w:iCs/>
+        </w:rPr>
+        <w:t>For Lot’s wife was told, ‘Do not turn around,’ and yet, she turned… and became the world’s first officially documented salt lamp.</w:t>
+      </w:r>
+    </w:p>
+    <w:p>
+      <w:pPr>
+        <w:pStyle w:val="p1"/>
+        <w:rPr>
+          <w:lang w:val="vi-VN"/>
+        </w:rPr>
+      </w:pPr>
+      <w:r>
+        <w:rPr>
+          <w:i/>
+          <w:iCs/>
+        </w:rPr>
+        <w:t>The lesson? When the divine GPS says ‘Recalculating,’ do not question it. Keep walking, lest you become a condiment.”</w:t>
+      </w:r>
+    </w:p>
+    <w:p>
+      <w:pPr>
+        <w:pStyle w:val="p1"/>
+      </w:pPr>
+      <w:r>
+        <w:t>The disciple, now deeply contemplating his own spice rack, hesitated, then asked,</w:t>
+      </w:r>
+    </w:p>
+    <w:p>
+      <w:pPr>
+        <w:pStyle w:val="p1"/>
+        <w:rPr>
+          <w:lang w:val="vi-VN"/>
+        </w:rPr>
+      </w:pPr>
+      <w:r>
+        <w:rPr>
+          <w:i/>
+          <w:iCs/>
+        </w:rPr>
+        <w:t>“So… was the destruction about morality?”</w:t>
+      </w:r>
+    </w:p>
+    <w:p>
+      <w:pPr>
+        <w:pStyle w:val="p1"/>
+      </w:pPr>
+      <w:r>
+        <w:t>And Absurdist Jesus smiled, saying:</w:t>
+      </w:r>
+    </w:p>
+    <w:p>
+      <w:pPr>
+        <w:pStyle w:val="p1"/>
+        <w:rPr>
+          <w:lang w:val="vi-VN"/>
+        </w:rPr>
+      </w:pPr>
+      <w:r>
+        <w:rPr>
+          <w:i/>
+          <w:iCs/>
+        </w:rPr>
+        <w:t>“Oh, morality was in there somewhere, like raisins in a loaf of bread that no one asked for. But my child, do you truly think an all-powerful God would send fire from the heavens just because of one sin? Nay, sometimes the cosmos simply decides to delete a city like a poorly written email.”</w:t>
+      </w:r>
+    </w:p>
+    <w:p>
+      <w:pPr>
+        <w:pStyle w:val="p1"/>
+        <w:rPr>
+          <w:lang w:val="vi-VN"/>
+        </w:rPr>
+      </w:pPr>
+      <w:r>
+        <w:rPr>
+          <w:i/>
+          <w:iCs/>
+        </w:rPr>
+        <w:t>“But remember this above all: had they built with fireproof bricks, the story might have ended differently. And that, too, is a parable.”</w:t>
+      </w:r>
+    </w:p>
+    <w:p>
+      <w:pPr>
+        <w:pStyle w:val="p1"/>
+      </w:pPr>
+      <w:r>
+        <w:t>And the disciple, unsure if he had just received wisdom or a construction tip, nodded… and did not look back.</w:t>
+      </w:r>
+    </w:p>
+    <w:p>
+      <w:pPr>
+        <w:spacing w:after="160" w:line="278" w:lineRule="auto"/>
+        <w:rPr>
+          <w:lang w:val="en-US"/>
+        </w:rPr>
+      </w:pPr>
+      <w:r>
+        <w:rPr>
+          <w:lang w:val="en-US"/>
+        </w:rPr>
+        <w:br w:type="page"/>
       </w:r>
     </w:p>
     <w:p>
@@ -64472,6 +64895,7 @@
   <w:style w:type="character" w:default="1" w:styleId="DefaultParagraphFont">
     <w:name w:val="Default Paragraph Font"/>
     <w:uiPriority w:val="1"/>
+    <w:semiHidden/>
     <w:unhideWhenUsed/>
   </w:style>
   <w:style w:type="table" w:default="1" w:styleId="TableNormal">

</xml_diff>